<commit_message>
Regenerate compatible Word tenant profile
</commit_message>
<xml_diff>
--- a/assets/tenant_profile_landlord_spanish_first_2026.docx
+++ b/assets/tenant_profile_landlord_spanish_first_2026.docx
@@ -18,7 +18,7 @@
     </w:p>
     <w:p>
       <w:pPr>
-        <w:spacing w:after="160"/>
+        <w:spacing w:after="120"/>
       </w:pPr>
       <w:r>
         <w:rPr>
@@ -41,7 +41,7 @@
           <w:color w:val="1D4ED8"/>
           <w:sz w:val="20"/>
         </w:rPr>
-        <w:t>Contrato de vivienda habitual  |  Empadronamiento familiar  |  Uso residencial familiar</w:t>
+        <w:t>Contrato de vivienda habitual | Empadronamiento familiar | Uso residencial familiar</w:t>
       </w:r>
     </w:p>
     <w:tbl>
@@ -58,36 +58,42 @@
       <w:tr>
         <w:tc>
           <w:tcPr>
-            <w:tcW w:type="dxa" w:w="2665"/>
+            <w:tcW w:type="dxa" w:w="5156"/>
             <w:shd w:fill="EFF6FF"/>
             <w:vAlign w:val="top"/>
           </w:tcPr>
           <w:p>
+            <w:pPr>
+              <w:spacing w:after="0"/>
+            </w:pPr>
             <w:r/>
             <w:r>
               <w:rPr>
                 <w:rFonts w:ascii="Arial" w:hAnsi="Arial" w:eastAsia="Microsoft YaHei"/>
                 <w:b/>
-                <w:sz w:val="20"/>
+                <w:sz w:val="19"/>
               </w:rPr>
-              <w:t>Composici?n familiar</w:t>
+              <w:t>Composicion familiar</w:t>
             </w:r>
           </w:p>
         </w:tc>
         <w:tc>
           <w:tcPr>
-            <w:tcW w:type="dxa" w:w="6803"/>
+            <w:tcW w:type="dxa" w:w="5156"/>
             <w:vAlign w:val="top"/>
           </w:tcPr>
           <w:p>
+            <w:pPr>
+              <w:spacing w:after="0"/>
+            </w:pPr>
             <w:r/>
             <w:r>
               <w:rPr>
                 <w:rFonts w:ascii="Arial" w:hAnsi="Arial" w:eastAsia="Microsoft YaHei"/>
                 <w:b w:val="0"/>
-                <w:sz w:val="20"/>
+                <w:sz w:val="19"/>
               </w:rPr>
-              <w:t>Marido: Wei Yuchen?????; esposa: Shang Wei????; hija: Wei Yiyi?????, nacida el 3 de junio de 2020. Familia de tres personas.</w:t>
+              <w:t>Marido: Wei Yuchen; esposa: Shang Wei; hija: Wei Yiyi, nacida el 3 de junio de 2020. Familia de tres personas.</w:t>
             </w:r>
           </w:p>
         </w:tc>
@@ -95,17 +101,20 @@
       <w:tr>
         <w:tc>
           <w:tcPr>
-            <w:tcW w:type="dxa" w:w="2665"/>
+            <w:tcW w:type="dxa" w:w="5156"/>
             <w:shd w:fill="EFF6FF"/>
             <w:vAlign w:val="top"/>
           </w:tcPr>
           <w:p>
+            <w:pPr>
+              <w:spacing w:after="0"/>
+            </w:pPr>
             <w:r/>
             <w:r>
               <w:rPr>
                 <w:rFonts w:ascii="Arial" w:hAnsi="Arial" w:eastAsia="Microsoft YaHei"/>
                 <w:b/>
-                <w:sz w:val="20"/>
+                <w:sz w:val="19"/>
               </w:rPr>
               <w:t>Uso de la vivienda</w:t>
             </w:r>
@@ -113,18 +122,21 @@
         </w:tc>
         <w:tc>
           <w:tcPr>
-            <w:tcW w:type="dxa" w:w="6803"/>
+            <w:tcW w:type="dxa" w:w="5156"/>
             <w:vAlign w:val="top"/>
           </w:tcPr>
           <w:p>
+            <w:pPr>
+              <w:spacing w:after="0"/>
+            </w:pPr>
             <w:r/>
             <w:r>
               <w:rPr>
                 <w:rFonts w:ascii="Arial" w:hAnsi="Arial" w:eastAsia="Microsoft YaHei"/>
                 <w:b w:val="0"/>
-                <w:sz w:val="20"/>
+                <w:sz w:val="19"/>
               </w:rPr>
-              <w:t>Residencia familiar estable y a largo plazo. No subarriendo, no uso tur?stico, no uso comercial.</w:t>
+              <w:t>Residencia familiar estable y a largo plazo. No subarriendo, no uso turistico, no uso comercial.</w:t>
             </w:r>
           </w:p>
         </w:tc>
@@ -132,17 +144,20 @@
       <w:tr>
         <w:tc>
           <w:tcPr>
-            <w:tcW w:type="dxa" w:w="2665"/>
+            <w:tcW w:type="dxa" w:w="5156"/>
             <w:shd w:fill="EFF6FF"/>
             <w:vAlign w:val="top"/>
           </w:tcPr>
           <w:p>
+            <w:pPr>
+              <w:spacing w:after="0"/>
+            </w:pPr>
             <w:r/>
             <w:r>
               <w:rPr>
                 <w:rFonts w:ascii="Arial" w:hAnsi="Arial" w:eastAsia="Microsoft YaHei"/>
                 <w:b/>
-                <w:sz w:val="20"/>
+                <w:sz w:val="19"/>
               </w:rPr>
               <w:t>Llegada prevista</w:t>
             </w:r>
@@ -150,16 +165,19 @@
         </w:tc>
         <w:tc>
           <w:tcPr>
-            <w:tcW w:type="dxa" w:w="6803"/>
+            <w:tcW w:type="dxa" w:w="5156"/>
             <w:vAlign w:val="top"/>
           </w:tcPr>
           <w:p>
+            <w:pPr>
+              <w:spacing w:after="0"/>
+            </w:pPr>
             <w:r/>
             <w:r>
               <w:rPr>
                 <w:rFonts w:ascii="Arial" w:hAnsi="Arial" w:eastAsia="Microsoft YaHei"/>
                 <w:b w:val="0"/>
-                <w:sz w:val="20"/>
+                <w:sz w:val="19"/>
               </w:rPr>
               <w:t>Alrededor de septiembre de 2026. Disponibles para visitar, firmar y entrar a vivir en esas fechas.</w:t>
             </w:r>
@@ -169,34 +187,40 @@
       <w:tr>
         <w:tc>
           <w:tcPr>
-            <w:tcW w:type="dxa" w:w="2665"/>
+            <w:tcW w:type="dxa" w:w="5156"/>
             <w:shd w:fill="EFF6FF"/>
             <w:vAlign w:val="top"/>
           </w:tcPr>
           <w:p>
+            <w:pPr>
+              <w:spacing w:after="0"/>
+            </w:pPr>
             <w:r/>
             <w:r>
               <w:rPr>
                 <w:rFonts w:ascii="Arial" w:hAnsi="Arial" w:eastAsia="Microsoft YaHei"/>
                 <w:b/>
-                <w:sz w:val="20"/>
+                <w:sz w:val="19"/>
               </w:rPr>
-              <w:t>H?bitos</w:t>
+              <w:t>Habitos</w:t>
             </w:r>
           </w:p>
         </w:tc>
         <w:tc>
           <w:tcPr>
-            <w:tcW w:type="dxa" w:w="6803"/>
+            <w:tcW w:type="dxa" w:w="5156"/>
             <w:vAlign w:val="top"/>
           </w:tcPr>
           <w:p>
+            <w:pPr>
+              <w:spacing w:after="0"/>
+            </w:pPr>
             <w:r/>
             <w:r>
               <w:rPr>
                 <w:rFonts w:ascii="Arial" w:hAnsi="Arial" w:eastAsia="Microsoft YaHei"/>
                 <w:b w:val="0"/>
-                <w:sz w:val="20"/>
+                <w:sz w:val="19"/>
               </w:rPr>
               <w:t>Sin mascotas, no fumadores, cuidaremos la vivienda y la mantendremos limpia y en buen estado.</w:t>
             </w:r>
@@ -206,17 +230,20 @@
       <w:tr>
         <w:tc>
           <w:tcPr>
-            <w:tcW w:type="dxa" w:w="2665"/>
+            <w:tcW w:type="dxa" w:w="5156"/>
             <w:shd w:fill="EFF6FF"/>
             <w:vAlign w:val="top"/>
           </w:tcPr>
           <w:p>
+            <w:pPr>
+              <w:spacing w:after="0"/>
+            </w:pPr>
             <w:r/>
             <w:r>
               <w:rPr>
                 <w:rFonts w:ascii="Arial" w:hAnsi="Arial" w:eastAsia="Microsoft YaHei"/>
                 <w:b/>
-                <w:sz w:val="20"/>
+                <w:sz w:val="19"/>
               </w:rPr>
               <w:t>Necesidad contractual</w:t>
             </w:r>
@@ -224,16 +251,19 @@
         </w:tc>
         <w:tc>
           <w:tcPr>
-            <w:tcW w:type="dxa" w:w="6803"/>
+            <w:tcW w:type="dxa" w:w="5156"/>
             <w:vAlign w:val="top"/>
           </w:tcPr>
           <w:p>
+            <w:pPr>
+              <w:spacing w:after="0"/>
+            </w:pPr>
             <w:r/>
             <w:r>
               <w:rPr>
                 <w:rFonts w:ascii="Arial" w:hAnsi="Arial" w:eastAsia="Microsoft YaHei"/>
                 <w:b w:val="0"/>
-                <w:sz w:val="20"/>
+                <w:sz w:val="19"/>
               </w:rPr>
               <w:t>Contrato de vivienda habitual.</w:t>
             </w:r>
@@ -243,17 +273,20 @@
       <w:tr>
         <w:tc>
           <w:tcPr>
-            <w:tcW w:type="dxa" w:w="2665"/>
+            <w:tcW w:type="dxa" w:w="5156"/>
             <w:shd w:fill="EFF6FF"/>
             <w:vAlign w:val="top"/>
           </w:tcPr>
           <w:p>
+            <w:pPr>
+              <w:spacing w:after="0"/>
+            </w:pPr>
             <w:r/>
             <w:r>
               <w:rPr>
                 <w:rFonts w:ascii="Arial" w:hAnsi="Arial" w:eastAsia="Microsoft YaHei"/>
                 <w:b/>
-                <w:sz w:val="20"/>
+                <w:sz w:val="19"/>
               </w:rPr>
               <w:t>Empadronamiento</w:t>
             </w:r>
@@ -261,18 +294,21 @@
         </w:tc>
         <w:tc>
           <w:tcPr>
-            <w:tcW w:type="dxa" w:w="6803"/>
+            <w:tcW w:type="dxa" w:w="5156"/>
             <w:vAlign w:val="top"/>
           </w:tcPr>
           <w:p>
+            <w:pPr>
+              <w:spacing w:after="0"/>
+            </w:pPr>
             <w:r/>
             <w:r>
               <w:rPr>
                 <w:rFonts w:ascii="Arial" w:hAnsi="Arial" w:eastAsia="Microsoft YaHei"/>
                 <w:b w:val="0"/>
-                <w:sz w:val="20"/>
+                <w:sz w:val="19"/>
               </w:rPr>
-              <w:t>Necesitamos poder empadronar a toda la familia por la escolarizaci?n de nuestro hijo/a.</w:t>
+              <w:t>Necesitamos poder empadronar a toda la familia por la escolarizacion de nuestro hijo/a.</w:t>
             </w:r>
           </w:p>
         </w:tc>
@@ -280,17 +316,20 @@
       <w:tr>
         <w:tc>
           <w:tcPr>
-            <w:tcW w:type="dxa" w:w="2665"/>
+            <w:tcW w:type="dxa" w:w="5156"/>
             <w:shd w:fill="EFF6FF"/>
             <w:vAlign w:val="top"/>
           </w:tcPr>
           <w:p>
+            <w:pPr>
+              <w:spacing w:after="0"/>
+            </w:pPr>
             <w:r/>
             <w:r>
               <w:rPr>
                 <w:rFonts w:ascii="Arial" w:hAnsi="Arial" w:eastAsia="Microsoft YaHei"/>
                 <w:b/>
-                <w:sz w:val="20"/>
+                <w:sz w:val="19"/>
               </w:rPr>
               <w:t>Solvencia</w:t>
             </w:r>
@@ -298,18 +337,21 @@
         </w:tc>
         <w:tc>
           <w:tcPr>
-            <w:tcW w:type="dxa" w:w="6803"/>
+            <w:tcW w:type="dxa" w:w="5156"/>
             <w:vAlign w:val="top"/>
           </w:tcPr>
           <w:p>
+            <w:pPr>
+              <w:spacing w:after="0"/>
+            </w:pPr>
             <w:r/>
             <w:r>
               <w:rPr>
                 <w:rFonts w:ascii="Arial" w:hAnsi="Arial" w:eastAsia="Microsoft YaHei"/>
                 <w:b w:val="0"/>
-                <w:sz w:val="20"/>
+                <w:sz w:val="19"/>
               </w:rPr>
-              <w:t>Trabajamos en Pek?n en empresas Fortune Global 500 del sector Internet/tecnolog?a; tenemos ingresos estables, varias propiedades en China y ahorros suficientes.</w:t>
+              <w:t>Trabajamos en Pekin en empresas Fortune Global 500 del sector Internet/tecnologia; tenemos ingresos estables, varias propiedades en China y ahorros suficientes.</w:t>
             </w:r>
           </w:p>
         </w:tc>
@@ -317,17 +359,20 @@
       <w:tr>
         <w:tc>
           <w:tcPr>
-            <w:tcW w:type="dxa" w:w="2665"/>
+            <w:tcW w:type="dxa" w:w="5156"/>
             <w:shd w:fill="EFF6FF"/>
             <w:vAlign w:val="top"/>
           </w:tcPr>
           <w:p>
+            <w:pPr>
+              <w:spacing w:after="0"/>
+            </w:pPr>
             <w:r/>
             <w:r>
               <w:rPr>
                 <w:rFonts w:ascii="Arial" w:hAnsi="Arial" w:eastAsia="Microsoft YaHei"/>
                 <w:b/>
-                <w:sz w:val="20"/>
+                <w:sz w:val="19"/>
               </w:rPr>
               <w:t>Contacto</w:t>
             </w:r>
@@ -335,16 +380,19 @@
         </w:tc>
         <w:tc>
           <w:tcPr>
-            <w:tcW w:type="dxa" w:w="6803"/>
+            <w:tcW w:type="dxa" w:w="5156"/>
             <w:vAlign w:val="top"/>
           </w:tcPr>
           <w:p>
+            <w:pPr>
+              <w:spacing w:after="0"/>
+            </w:pPr>
             <w:r/>
             <w:r>
               <w:rPr>
                 <w:rFonts w:ascii="Arial" w:hAnsi="Arial" w:eastAsia="Microsoft YaHei"/>
                 <w:b w:val="0"/>
-                <w:sz w:val="20"/>
+                <w:sz w:val="19"/>
               </w:rPr>
               <w:t>Email: possbb@hotmail.com / possbb@gmail.com</w:t>
               <w:br/>
@@ -363,14 +411,14 @@
           <w:rFonts w:ascii="Arial" w:hAnsi="Arial" w:eastAsia="Microsoft YaHei"/>
           <w:b/>
           <w:color w:val="1D4ED8"/>
-          <w:sz w:val="32"/>
+          <w:sz w:val="30"/>
         </w:rPr>
-        <w:t>1. Versi?n principal en espa?ol</w:t>
+        <w:t>1. Version principal en espanol</w:t>
       </w:r>
     </w:p>
     <w:p>
       <w:pPr>
-        <w:spacing w:after="120"/>
+        <w:spacing w:after="100"/>
       </w:pPr>
       <w:r>
         <w:rPr>
@@ -383,7 +431,7 @@
     </w:p>
     <w:p>
       <w:pPr>
-        <w:spacing w:after="120"/>
+        <w:spacing w:after="100"/>
       </w:pPr>
       <w:r>
         <w:rPr>
@@ -391,12 +439,12 @@
           <w:b w:val="0"/>
           <w:sz w:val="21"/>
         </w:rPr>
-        <w:t>Somos una familia china de tres personas: el marido Wei Yuchen?????, la esposa Shang Wei???? y nuestra hija Wei Yiyi?????, nacida el 3 de junio de 2020. No tenemos mascotas y no fumamos. Buscamos una vivienda en Barcelona para vivir de forma estable y a largo plazo como residencia familiar.</w:t>
+        <w:t>Somos una familia china de tres personas: el marido Wei Yuchen, la esposa Shang Wei y nuestra hija Wei Yiyi, nacida el 3 de junio de 2020. No tenemos mascotas y no fumamos. Buscamos una vivienda en Barcelona para vivir de forma estable y a largo plazo como residencia familiar.</w:t>
       </w:r>
     </w:p>
     <w:p>
       <w:pPr>
-        <w:spacing w:after="120"/>
+        <w:spacing w:after="100"/>
       </w:pPr>
       <w:r>
         <w:rPr>
@@ -404,12 +452,12 @@
           <w:b w:val="0"/>
           <w:sz w:val="21"/>
         </w:rPr>
-        <w:t>Tenemos previsto llegar a Barcelona alrededor de septiembre de 2026. A partir de entonces podr?amos visitar la vivienda, firmar el contrato y entrar a vivir. Ya hemos visitado Barcelona anteriormente y nos gustaron mucho su clima, su cultura y su ambiente de vida. Queremos que nuestro hijo/a pueda vivir y estudiar en un entorno estable y adecuado.</w:t>
+        <w:t>Tenemos previsto llegar a Barcelona alrededor de septiembre de 2026. A partir de entonces podriamos visitar la vivienda, firmar el contrato y entrar a vivir. Ya hemos visitado Barcelona anteriormente y nos gustaron mucho su clima, su cultura y su ambiente de vida. Queremos que nuestro hijo/a pueda vivir y estudiar en un entorno estable y adecuado.</w:t>
       </w:r>
     </w:p>
     <w:p>
       <w:pPr>
-        <w:spacing w:after="120"/>
+        <w:spacing w:after="100"/>
       </w:pPr>
       <w:r>
         <w:rPr>
@@ -417,12 +465,12 @@
           <w:b w:val="0"/>
           <w:sz w:val="21"/>
         </w:rPr>
-        <w:t>Actualmente trabajamos en Pek?n, China, en empresas Fortune Global 500 del sector de Internet/tecnolog?a. Tenemos ingresos estables, varias propiedades en China y ahorros suficientes. Si fuera necesario, podemos aportar justificantes de ingresos, extractos bancarios, prueba de ahorros u otros documentos de solvencia econ?mica.</w:t>
+        <w:t>Actualmente trabajamos en Pekin, China, en empresas Fortune Global 500 del sector de Internet/tecnologia. Tenemos ingresos estables, varias propiedades en China y ahorros suficientes. Si fuera necesario, podemos aportar justificantes de ingresos, extractos bancarios, prueba de ahorros u otros documentos de solvencia economica.</w:t>
       </w:r>
     </w:p>
     <w:p>
       <w:pPr>
-        <w:spacing w:after="120"/>
+        <w:spacing w:after="100"/>
       </w:pPr>
       <w:r>
         <w:rPr>
@@ -430,12 +478,12 @@
           <w:b w:val="0"/>
           <w:sz w:val="21"/>
         </w:rPr>
-        <w:t>Necesitamos un contrato de vivienda habitual y poder empadronar a toda la familia, ya que el empadronamiento es necesario para la escolarizaci?n de nuestro hijo/a.</w:t>
+        <w:t>Necesitamos un contrato de vivienda habitual y poder empadronar a toda la familia, ya que el empadronamiento es necesario para la escolarizacion de nuestro hijo/a.</w:t>
       </w:r>
     </w:p>
     <w:p>
       <w:pPr>
-        <w:spacing w:after="120"/>
+        <w:spacing w:after="100"/>
       </w:pPr>
       <w:r>
         <w:rPr>
@@ -443,12 +491,12 @@
           <w:b w:val="0"/>
           <w:sz w:val="21"/>
         </w:rPr>
-        <w:t>Cuidaremos la vivienda con responsabilidad y la mantendremos limpia y en buen estado. El uso de la vivienda ser? exclusivamente residencial para nuestra familia. No subarrendaremos la vivienda, no la utilizaremos como alojamiento tur?stico ni para ning?n uso comercial.</w:t>
+        <w:t>Cuidaremos la vivienda con responsabilidad y la mantendremos limpia y en buen estado. El uso de la vivienda sera exclusivamente residencial para nuestra familia. No subarrendaremos la vivienda, no la utilizaremos como alojamiento turistico ni para ningun uso comercial.</w:t>
       </w:r>
     </w:p>
     <w:p>
       <w:pPr>
-        <w:spacing w:after="120"/>
+        <w:spacing w:after="100"/>
       </w:pPr>
       <w:r>
         <w:rPr>
@@ -456,12 +504,12 @@
           <w:b w:val="0"/>
           <w:sz w:val="21"/>
         </w:rPr>
-        <w:t>Estamos dispuestos a aportar con antelaci?n la documentaci?n necesaria para que el propietario o la agencia pueda revisarla antes de la firma del contrato. Tambi?n nos gustar?a mantener una comunicaci?n estable, respetuosa y clara con el propietario durante toda la relaci?n de alquiler.</w:t>
+        <w:t>Estamos dispuestos a aportar con antelacion la documentacion necesaria para que el propietario o la agencia pueda revisarla antes de la firma del contrato. Tambien nos gustaria mantener una comunicacion estable, respetuosa y clara con el propietario durante toda la relacion de alquiler.</w:t>
       </w:r>
     </w:p>
     <w:p>
       <w:pPr>
-        <w:spacing w:after="120"/>
+        <w:spacing w:after="100"/>
       </w:pPr>
       <w:r>
         <w:rPr>
@@ -469,12 +517,12 @@
           <w:b w:val="0"/>
           <w:sz w:val="21"/>
         </w:rPr>
-        <w:t>Si la vivienda es adecuada para una familia y permite el empadronamiento de toda la familia, nos gustar?a recibir m?s informaci?n y coordinar una visita.</w:t>
+        <w:t>Si la vivienda es adecuada para una familia y permite el empadronamiento de toda la familia, nos gustaria recibir mas informacion y coordinar una visita.</w:t>
       </w:r>
     </w:p>
     <w:p>
       <w:pPr>
-        <w:spacing w:after="120"/>
+        <w:spacing w:after="100"/>
       </w:pPr>
       <w:r>
         <w:rPr>
@@ -499,14 +547,14 @@
           <w:rFonts w:ascii="Arial" w:hAnsi="Arial" w:eastAsia="Microsoft YaHei"/>
           <w:b/>
           <w:color w:val="1D4ED8"/>
-          <w:sz w:val="32"/>
+          <w:sz w:val="30"/>
         </w:rPr>
-        <w:t>2. Versi? en catal?</w:t>
+        <w:t>2. Versio en catala</w:t>
       </w:r>
     </w:p>
     <w:p>
       <w:pPr>
-        <w:spacing w:after="120"/>
+        <w:spacing w:after="100"/>
       </w:pPr>
       <w:r>
         <w:rPr>
@@ -519,7 +567,7 @@
     </w:p>
     <w:p>
       <w:pPr>
-        <w:spacing w:after="120"/>
+        <w:spacing w:after="100"/>
       </w:pPr>
       <w:r>
         <w:rPr>
@@ -527,12 +575,12 @@
           <w:b w:val="0"/>
           <w:sz w:val="21"/>
         </w:rPr>
-        <w:t>Som una fam?lia xinesa de tres persones: el marit Wei Yuchen?????, l?esposa Shang Wei???? i la nostra filla Wei Yiyi?????, nascuda el 3 de juny de 2020. No tenim mascotes i no fumem. Busquem un habitatge a Barcelona per viure-hi de manera estable i a llarg termini com a resid?ncia familiar.</w:t>
+        <w:t>Som una familia xinesa de tres persones: el marit Wei Yuchen, l esposa Shang Wei i la nostra filla Wei Yiyi, nascuda el 3 de juny de 2020. No tenim mascotes i no fumem. Busquem un habitatge a Barcelona per viure-hi de manera estable i a llarg termini com a residencia familiar.</w:t>
       </w:r>
     </w:p>
     <w:p>
       <w:pPr>
-        <w:spacing w:after="120"/>
+        <w:spacing w:after="100"/>
       </w:pPr>
       <w:r>
         <w:rPr>
@@ -540,12 +588,12 @@
           <w:b w:val="0"/>
           <w:sz w:val="21"/>
         </w:rPr>
-        <w:t>Tenim previst arribar a Barcelona al voltant del setembre de 2026. A partir d?aquell moment podr?em visitar l?habitatge, signar el contracte i entrar-hi a viure. Ja hem visitat Barcelona anteriorment i ens van agradar molt el seu clima, la seva cultura i el seu ambient de vida. Volem que el nostre fill o filla pugui viure i estudiar en un entorn estable i adequat.</w:t>
+        <w:t>Tenim previst arribar a Barcelona al voltant del setembre de 2026. A partir d aquell moment podriem visitar l habitatge, signar el contracte i entrar-hi a viure. Ja hem visitat Barcelona anteriorment i ens van agradar molt el seu clima, la seva cultura i el seu ambient de vida. Volem que el nostre fill o filla pugui viure i estudiar en un entorn estable i adequat.</w:t>
       </w:r>
     </w:p>
     <w:p>
       <w:pPr>
-        <w:spacing w:after="120"/>
+        <w:spacing w:after="100"/>
       </w:pPr>
       <w:r>
         <w:rPr>
@@ -553,12 +601,12 @@
           <w:b w:val="0"/>
           <w:sz w:val="21"/>
         </w:rPr>
-        <w:t>Actualment treballem a Pequ?n, Xina, en empreses Fortune Global 500 del sector d?Internet/tecnologia. Tenim ingressos estables, diverses propietats a la Xina i estalvis suficients. Si fos necessari, podem aportar justificants d?ingressos, extractes bancaris, prova d?estalvis o altres documents de solv?ncia econ?mica.</w:t>
+        <w:t>Actualment treballem a Pequin, Xina, en empreses Fortune Global 500 del sector d Internet/tecnologia. Tenim ingressos estables, diverses propietats a la Xina i estalvis suficients. Si fos necessari, podem aportar justificants d ingressos, extractes bancaris, prova d estalvis o altres documents de solvencia economica.</w:t>
       </w:r>
     </w:p>
     <w:p>
       <w:pPr>
-        <w:spacing w:after="120"/>
+        <w:spacing w:after="100"/>
       </w:pPr>
       <w:r>
         <w:rPr>
@@ -566,12 +614,12 @@
           <w:b w:val="0"/>
           <w:sz w:val="21"/>
         </w:rPr>
-        <w:t>Necessitem un contracte d?habitatge habitual i poder empadronar tota la fam?lia, ja que l?empadronament ?s necessari per a l?escolaritzaci? del nostre fill o filla.</w:t>
+        <w:t>Necessitem un contracte d habitatge habitual i poder empadronar tota la familia, ja que l empadronament es necessari per a l escolaritzacio del nostre fill o filla.</w:t>
       </w:r>
     </w:p>
     <w:p>
       <w:pPr>
-        <w:spacing w:after="120"/>
+        <w:spacing w:after="100"/>
       </w:pPr>
       <w:r>
         <w:rPr>
@@ -579,12 +627,12 @@
           <w:b w:val="0"/>
           <w:sz w:val="21"/>
         </w:rPr>
-        <w:t>Cuidarem l?habitatge amb responsabilitat i el mantindrem net i en bon estat. L??s de l?habitatge ser? exclusivament residencial per a la nostra fam?lia. No subarrendarem l?habitatge, no l?utilitzarem com a allotjament tur?stic ni per a cap ?s comercial.</w:t>
+        <w:t>Cuidarem l habitatge amb responsabilitat i el mantindrem net i en bon estat. L us de l habitatge sera exclusivament residencial per a la nostra familia. No subarrendarem l habitatge, no l utilitzarem com a allotjament turistic ni per a cap us comercial.</w:t>
       </w:r>
     </w:p>
     <w:p>
       <w:pPr>
-        <w:spacing w:after="120"/>
+        <w:spacing w:after="100"/>
       </w:pPr>
       <w:r>
         <w:rPr>
@@ -592,12 +640,12 @@
           <w:b w:val="0"/>
           <w:sz w:val="21"/>
         </w:rPr>
-        <w:t>Estem disposats a aportar amb antelaci? la documentaci? necess?ria perqu? la propietat o l?ag?ncia la pugui revisar abans de la signatura del contracte. Tamb? ens agradaria mantenir una comunicaci? estable, respectuosa i clara amb la propietat durant tota la relaci? de lloguer.</w:t>
+        <w:t>Estem disposats a aportar amb antelacio la documentacio necessaria perque la propietat o l agencia la pugui revisar abans de la signatura del contracte. Tambe ens agradaria mantenir una comunicacio estable, respectuosa i clara amb la propietat durant tota la relacio de lloguer.</w:t>
       </w:r>
     </w:p>
     <w:p>
       <w:pPr>
-        <w:spacing w:after="120"/>
+        <w:spacing w:after="100"/>
       </w:pPr>
       <w:r>
         <w:rPr>
@@ -605,12 +653,12 @@
           <w:b w:val="0"/>
           <w:sz w:val="21"/>
         </w:rPr>
-        <w:t>Si l?habitatge ?s adequat per a una fam?lia i permet l?empadronament de tota la fam?lia, ens agradaria rebre m?s informaci? i coordinar una visita.</w:t>
+        <w:t>Si l habitatge es adequat per a una familia i permet l empadronament de tota la familia, ens agradaria rebre mes informacio i coordinar una visita.</w:t>
       </w:r>
     </w:p>
     <w:p>
       <w:pPr>
-        <w:spacing w:after="120"/>
+        <w:spacing w:after="100"/>
       </w:pPr>
       <w:r>
         <w:rPr>
@@ -618,7 +666,7 @@
           <w:b w:val="0"/>
           <w:sz w:val="21"/>
         </w:rPr>
-        <w:t>Moltes gr?cies.</w:t>
+        <w:t>Moltes gracies.</w:t>
       </w:r>
     </w:p>
     <w:p>
@@ -630,14 +678,14 @@
           <w:rFonts w:ascii="Arial" w:hAnsi="Arial" w:eastAsia="Microsoft YaHei"/>
           <w:b/>
           <w:color w:val="1D4ED8"/>
-          <w:sz w:val="32"/>
+          <w:sz w:val="30"/>
         </w:rPr>
         <w:t>3. English Version</w:t>
       </w:r>
     </w:p>
     <w:p>
       <w:pPr>
-        <w:spacing w:after="120"/>
+        <w:spacing w:after="100"/>
       </w:pPr>
       <w:r>
         <w:rPr>
@@ -650,7 +698,7 @@
     </w:p>
     <w:p>
       <w:pPr>
-        <w:spacing w:after="120"/>
+        <w:spacing w:after="100"/>
       </w:pPr>
       <w:r>
         <w:rPr>
@@ -658,12 +706,12 @@
           <w:b w:val="0"/>
           <w:sz w:val="21"/>
         </w:rPr>
-        <w:t>We are a Chinese family of three: husband Wei Yuchen?????, wife Shang Wei????, and our daughter Wei Yiyi?????, born on June 3, 2020. We do not have pets and we do not smoke. We are looking for a home in Barcelona for stable, long-term family residence.</w:t>
+        <w:t>We are a Chinese family of three: husband Wei Yuchen, wife Shang Wei, and our daughter Wei Yiyi, born on June 3, 2020. We do not have pets and we do not smoke. We are looking for a home in Barcelona for stable, long-term family residence.</w:t>
       </w:r>
     </w:p>
     <w:p>
       <w:pPr>
-        <w:spacing w:after="120"/>
+        <w:spacing w:after="100"/>
       </w:pPr>
       <w:r>
         <w:rPr>
@@ -676,7 +724,7 @@
     </w:p>
     <w:p>
       <w:pPr>
-        <w:spacing w:after="120"/>
+        <w:spacing w:after="100"/>
       </w:pPr>
       <w:r>
         <w:rPr>
@@ -689,7 +737,7 @@
     </w:p>
     <w:p>
       <w:pPr>
-        <w:spacing w:after="120"/>
+        <w:spacing w:after="100"/>
       </w:pPr>
       <w:r>
         <w:rPr>
@@ -697,12 +745,12 @@
           <w:b w:val="0"/>
           <w:sz w:val="21"/>
         </w:rPr>
-        <w:t>We need a vivienda habitual long-term residence contract and we need to be able to register the whole family for empadronamiento, as this is required for our child?s school application.</w:t>
+        <w:t>We need a vivienda habitual long-term residence contract and we need to be able to register the whole family for empadronamiento, as this is required for our child school application.</w:t>
       </w:r>
     </w:p>
     <w:p>
       <w:pPr>
-        <w:spacing w:after="120"/>
+        <w:spacing w:after="100"/>
       </w:pPr>
       <w:r>
         <w:rPr>
@@ -715,7 +763,7 @@
     </w:p>
     <w:p>
       <w:pPr>
-        <w:spacing w:after="120"/>
+        <w:spacing w:after="100"/>
       </w:pPr>
       <w:r>
         <w:rPr>
@@ -728,7 +776,7 @@
     </w:p>
     <w:p>
       <w:pPr>
-        <w:spacing w:after="120"/>
+        <w:spacing w:after="100"/>
       </w:pPr>
       <w:r>
         <w:rPr>
@@ -741,7 +789,7 @@
     </w:p>
     <w:p>
       <w:pPr>
-        <w:spacing w:after="120"/>
+        <w:spacing w:after="100"/>
       </w:pPr>
       <w:r>
         <w:rPr>
@@ -766,14 +814,14 @@
           <w:rFonts w:ascii="Arial" w:hAnsi="Arial" w:eastAsia="Microsoft YaHei"/>
           <w:b/>
           <w:color w:val="1D4ED8"/>
-          <w:sz w:val="32"/>
+          <w:sz w:val="30"/>
         </w:rPr>
-        <w:t>4. ????</w:t>
+        <w:t>4. Chinese Version / 中文版本</w:t>
       </w:r>
     </w:p>
     <w:p>
       <w:pPr>
-        <w:spacing w:after="120"/>
+        <w:spacing w:after="100"/>
       </w:pPr>
       <w:r>
         <w:rPr>
@@ -781,12 +829,12 @@
           <w:b w:val="0"/>
           <w:sz w:val="21"/>
         </w:rPr>
-        <w:t>?????????????????????Wei Yuchen???????Shang Wei????????Wei Yiyi??????2020?6?3????????????????????????????????????????????????????</w:t>
+        <w:t>您好，我们是一家三口中国家庭，丈夫魏宇辰（Wei Yuchen）、妻子尚薇（Shang Wei）和女儿魏依一（Wei Yiyi，出生日期：2020年6月3日）一起入住。我们没有宠物，不吸烟，租房目的是家庭长期自住，不会转租，不会用于民宿、短租或任何商业用途。</w:t>
       </w:r>
     </w:p>
     <w:p>
       <w:pPr>
-        <w:spacing w:after="120"/>
+        <w:spacing w:after="100"/>
       </w:pPr>
       <w:r>
         <w:rPr>
@@ -794,12 +842,12 @@
           <w:b w:val="0"/>
           <w:sz w:val="21"/>
         </w:rPr>
-        <w:t>?????2026?9???????????????????????????????????????????????????????????????????????????????????????????</w:t>
+        <w:t>我们计划在2026年9月左右到达巴塞罗那，届时可以看房、签约并入住。我们之前来过巴塞罗那旅行，非常喜欢这里的气候、文化和生活环境，也希望孩子能在这里长期生活和上学，所以正在寻找一套适合家庭长期居住的房子。</w:t>
       </w:r>
     </w:p>
     <w:p>
       <w:pPr>
-        <w:spacing w:after="120"/>
+        <w:spacing w:after="100"/>
       </w:pPr>
       <w:r>
         <w:rPr>
@@ -807,12 +855,12 @@
           <w:b w:val="0"/>
           <w:sz w:val="21"/>
         </w:rPr>
-        <w:t>????????????500????????????????????????????????????????????????????????????????????</w:t>
+        <w:t>我们目前在中国北京的世界500强企业从事互联网相关工作，收入稳定。家中在中国有多套住房，存款也充足。如有需要，我们可以提供收入证明、银行流水、存款证明或其他资产证明。</w:t>
       </w:r>
     </w:p>
     <w:p>
       <w:pPr>
-        <w:spacing w:after="120"/>
+        <w:spacing w:after="100"/>
       </w:pPr>
       <w:r>
         <w:rPr>
@@ -820,12 +868,12 @@
           <w:b w:val="0"/>
           <w:sz w:val="21"/>
         </w:rPr>
-        <w:t>????????????????? vivienda habitual??????/??????????????????? empadronamiento???????/??????</w:t>
+        <w:t>因为孩子需要申请学校，我们需要签署 vivienda habitual（长期自住房/常住房租赁）合同，并且需要全家可以办理 empadronamiento（市政住址登记/住家证明）。</w:t>
       </w:r>
     </w:p>
     <w:p>
       <w:pPr>
-        <w:spacing w:after="120"/>
+        <w:spacing w:after="100"/>
       </w:pPr>
       <w:r>
         <w:rPr>
@@ -833,12 +881,12 @@
           <w:b w:val="0"/>
           <w:sz w:val="21"/>
         </w:rPr>
-        <w:t>??????????????????????????????????????????????????????????????????????????????</w:t>
+        <w:t>我们会认真维护房屋整洁，尊重房东和社区规则。我们也愿意在看房和签约前提前提供必要材料供房东或中介审核，并希望在整个租赁期间与房东保持稳定、尊重、清晰的沟通。</w:t>
       </w:r>
     </w:p>
     <w:p>
       <w:pPr>
-        <w:spacing w:after="120"/>
+        <w:spacing w:after="100"/>
       </w:pPr>
       <w:r>
         <w:rPr>
@@ -846,7 +894,7 @@
           <w:b w:val="0"/>
           <w:sz w:val="21"/>
         </w:rPr>
-        <w:t>???????????????????????????????????????????</w:t>
+        <w:t>如果房源适合家庭长期居住，并且可以办理全家住址登记，我们非常希望进一步了解并安排看房。</w:t>
       </w:r>
     </w:p>
     <w:sectPr>

</xml_diff>